<commit_message>
Recoloca conteúdo de 09/10 (formato carrossel em vez de vídeo)
Correção: o pedido era substituir o vídeo por outro formato, não
remover a data do calendário. O dia 09/10 volta com a mesma piada
("síndico eternizado no cargo"), adaptada para carrossel/ilustração,
sem necessidade de filmagem — mantendo o arco narrativo de assembleia
junto com 07/10 e 21/10. Outubro volta a ter 9 datas de conteúdo.

Co-Authored-By: Claude Sonnet 5 <noreply@anthropic.com>
Claude-Session: https://claude.ai/code/session_01Qco3rELextfq6k1B91gUBk
</commit_message>
<xml_diff>
--- a/strategia-sindicos/calendarios-editoriais/Calendario_Editorial_Strategia_Outubro2026.docx
+++ b/strategia-sindicos/calendarios-editoriais/Calendario_Editorial_Strategia_Outubro2026.docx
@@ -25,7 +25,7 @@
         <w:rPr>
           <w:b w:val="0"/>
         </w:rPr>
-        <w:t>● OUTUBRO — Datas: 02/10 (Sex) · 07/10 (Qua) · 12/10 (Seg — Dia das Crianças) · 16/10 (Sex) · 21/10 (Qua) · 23/10 (Sex) · 28/10 (Qua) · 30/10 (Sex)</w:t>
+        <w:t>● OUTUBRO — Datas: 02/10 (Sex) · 07/10 (Qua) · 09/10 (Sex) · 12/10 (Seg — Dia das Crianças) · 16/10 (Sex) · 21/10 (Qua) · 23/10 (Sex) · 28/10 (Qua) · 30/10 (Sex)</w:t>
       </w:r>
     </w:p>
     <w:p>
@@ -34,7 +34,7 @@
         <w:rPr>
           <w:b w:val="0"/>
         </w:rPr>
-        <w:t>Nota: Calendário revisado após os ajustes da cliente. O post de 09/10 foi retirado (vídeo inviável de gravar). O carrossel de assembleia ganhou mais profundidade e passou de 02/10 para 07/10; o antigo carrossel de 07/10 ("motivos pra conhecer a Strategia") foi remanejado para 21/10, no lugar do post de humor que estava ali. O conteúdo de 28/10 (que estava muito parecido com o de 23/10) foi movido para o calendário de novembro, e um novo tema entrou no lugar. O Halloween do síndico (30/10) virou carrossel em vez de vídeo. Os dias 16/10 e 23/10 agora têm um "Plano B" em formato estático, caso não seja possível gravar o vídeo. Datas extras que podem entrar num próximo ajuste, se fizer sentido: Outubro Rosa (mês inteiro, campanha de conscientização — post institucional/leve) e Dia Mundial da Poupança (31/10, cai num sábado este ano — combina com o tema de fundo de reserva/economia do condomínio).</w:t>
+        <w:t>Nota: Calendário revisado após os ajustes da cliente. O post de 09/10 não foi retirado do calendário — o vídeo que estava previsto virou carrossel/ilustração, já que não vai ser possível filmar. O carrossel de assembleia ganhou mais profundidade e passou de 02/10 para 07/10; o antigo carrossel de 07/10 ("motivos pra conhecer a Strategia") foi remanejado para 21/10, no lugar do post de humor que estava ali. O conteúdo de 28/10 (que estava muito parecido com o de 23/10) foi movido para o calendário de novembro, e um novo tema entrou no lugar. O Halloween do síndico (30/10) também virou carrossel em vez de vídeo. Os dias 16/10 e 23/10 têm um "Plano B" em formato estático, caso não seja possível gravar o vídeo. Datas extras que podem entrar num próximo ajuste, se fizer sentido: Outubro Rosa (mês inteiro, campanha de conscientização — post institucional/leve) e Dia Mundial da Poupança (31/10, cai num sábado este ano — combina com o tema de fundo de reserva/economia do condomínio).</w:t>
       </w:r>
     </w:p>
     <w:p>
@@ -483,6 +483,230 @@
           <w:b w:val="0"/>
         </w:rPr>
         <w:t>S4: Ainda dá tempo de conhecer a Strategia antes da sua assembleia. Comenta ASSEMBLEIA. 👆</w:t>
+      </w:r>
+    </w:p>
+    <w:p>
+      <w:pPr>
+        <w:pStyle w:val="Heading2"/>
+      </w:pPr>
+      <w:r>
+        <w:t>Sexta, 09/10</w:t>
+      </w:r>
+    </w:p>
+    <w:p>
+      <w:pPr/>
+      <w:r>
+        <w:rPr>
+          <w:b w:val="0"/>
+        </w:rPr>
+        <w:t>Referência: mesma piada que estava prevista para vídeo, adaptada para carrossel/ilustração (sem necessidade de filmagem)</w:t>
+      </w:r>
+    </w:p>
+    <w:p>
+      <w:pPr/>
+      <w:r>
+        <w:rPr>
+          <w:b w:val="0"/>
+        </w:rPr>
+        <w:t>Objetivo: Geração de demanda — mesmo tema de 07/10 e 21/10 (assembleia), agora em tom humorado</w:t>
+      </w:r>
+    </w:p>
+    <w:p>
+      <w:pPr/>
+      <w:r>
+        <w:rPr>
+          <w:b w:val="0"/>
+        </w:rPr>
+        <w:t>Temática macro: O síndico "eternizado" no cargo, porque ninguém mais quis assumir</w:t>
+      </w:r>
+    </w:p>
+    <w:p>
+      <w:pPr/>
+      <w:r>
+        <w:rPr>
+          <w:b w:val="0"/>
+        </w:rPr>
+        <w:t>Eixo: Gatilho de humor: reconduzir o síndico no automático, só porque ninguém se candidatou · Desejo: leveza e identificação</w:t>
+      </w:r>
+    </w:p>
+    <w:p>
+      <w:pPr/>
+      <w:r>
+        <w:rPr>
+          <w:b/>
+        </w:rPr>
+        <w:t>Cards</w:t>
+      </w:r>
+    </w:p>
+    <w:p>
+      <w:pPr/>
+      <w:r>
+        <w:rPr>
+          <w:b w:val="0"/>
+        </w:rPr>
+        <w:t>Card 1 — Capa</w:t>
+      </w:r>
+    </w:p>
+    <w:p>
+      <w:pPr/>
+      <w:r>
+        <w:rPr>
+          <w:b w:val="0"/>
+        </w:rPr>
+        <w:t>Headline: "Alguém se candidata a síndico?"</w:t>
+      </w:r>
+    </w:p>
+    <w:p>
+      <w:pPr/>
+      <w:r>
+        <w:rPr>
+          <w:b w:val="0"/>
+        </w:rPr>
+        <w:t>Visual: ilustração leve com tom de humor — uma assembleia de condomínio, todo mundo olhando pro teto/pro lado, ninguém levanta a mão. Fundo claro.</w:t>
+      </w:r>
+    </w:p>
+    <w:p>
+      <w:pPr/>
+      <w:r>
+        <w:rPr>
+          <w:b w:val="0"/>
+        </w:rPr>
+        <w:t>Card 2</w:t>
+      </w:r>
+    </w:p>
+    <w:p>
+      <w:pPr/>
+      <w:r>
+        <w:rPr>
+          <w:b w:val="0"/>
+        </w:rPr>
+        <w:t>"..."</w:t>
+      </w:r>
+    </w:p>
+    <w:p>
+      <w:pPr/>
+      <w:r>
+        <w:rPr>
+          <w:b w:val="0"/>
+        </w:rPr>
+        <w:t>Visual: mesma cena, silêncio constrangedor, relógio marcando o tempo passando.</w:t>
+      </w:r>
+    </w:p>
+    <w:p>
+      <w:pPr/>
+      <w:r>
+        <w:rPr>
+          <w:b w:val="0"/>
+        </w:rPr>
+        <w:t>Card 3</w:t>
+      </w:r>
+    </w:p>
+    <w:p>
+      <w:pPr/>
+      <w:r>
+        <w:rPr>
+          <w:b w:val="0"/>
+        </w:rPr>
+        <w:t>"E assim, pelo quinto ano seguido, ele foi reeleito. Por unanimidade. Por falta de opção."</w:t>
+      </w:r>
+    </w:p>
+    <w:p>
+      <w:pPr/>
+      <w:r>
+        <w:rPr>
+          <w:b w:val="0"/>
+        </w:rPr>
+        <w:t>Visual: ilustração do mesmo morador de sempre, cara de resignado, sendo aplaudido sem muito entusiasmo.</w:t>
+      </w:r>
+    </w:p>
+    <w:p>
+      <w:pPr/>
+      <w:r>
+        <w:rPr>
+          <w:b w:val="0"/>
+        </w:rPr>
+        <w:t>Card 4 — CTA</w:t>
+      </w:r>
+    </w:p>
+    <w:p>
+      <w:pPr/>
+      <w:r>
+        <w:rPr>
+          <w:b w:val="0"/>
+        </w:rPr>
+        <w:t>Se a sua assembleia também "resolve" assim, talvez seja hora de considerar uma opção que não depende de ninguém topar o perrengue.</w:t>
+      </w:r>
+    </w:p>
+    <w:p>
+      <w:pPr/>
+      <w:r>
+        <w:rPr>
+          <w:b w:val="0"/>
+        </w:rPr>
+        <w:t>Comente: ASSEMBLEIA e olhe o seu direct.</w:t>
+      </w:r>
+    </w:p>
+    <w:p>
+      <w:pPr/>
+      <w:r>
+        <w:rPr>
+          <w:b/>
+        </w:rPr>
+        <w:t>Legenda</w:t>
+      </w:r>
+    </w:p>
+    <w:p>
+      <w:pPr/>
+      <w:r>
+        <w:rPr>
+          <w:b w:val="0"/>
+        </w:rPr>
+        <w:t>Se a sua assembleia também "resolve" assim, talvez seja hora de considerar uma opção que não depende de ninguém topar o perrengue 😅</w:t>
+      </w:r>
+    </w:p>
+    <w:p>
+      <w:pPr/>
+      <w:r>
+        <w:rPr>
+          <w:b w:val="0"/>
+        </w:rPr>
+        <w:t>Ainda dá tempo de conhecer a Strategia antes da sua assembleia.</w:t>
+      </w:r>
+    </w:p>
+    <w:p>
+      <w:pPr/>
+      <w:r>
+        <w:rPr>
+          <w:b w:val="0"/>
+        </w:rPr>
+        <w:t>Comente: ASSEMBLEIA e olhe o seu direct.</w:t>
+      </w:r>
+    </w:p>
+    <w:p>
+      <w:pPr/>
+      <w:r>
+        <w:rPr>
+          <w:b/>
+        </w:rPr>
+        <w:t>Stories (sequência de 2)</w:t>
+      </w:r>
+    </w:p>
+    <w:p>
+      <w:pPr/>
+      <w:r>
+        <w:rPr>
+          <w:b w:val="0"/>
+        </w:rPr>
+        <w:t>S1: Assembleia decidindo síndico por eliminação, alguém se identifica? 👀</w:t>
+      </w:r>
+    </w:p>
+    <w:p>
+      <w:pPr/>
+      <w:r>
+        <w:rPr>
+          <w:b w:val="0"/>
+        </w:rPr>
+        <w:t>S2: Confere o carrossel completo no feed e comenta ASSEMBLEIA. 👆</w:t>
       </w:r>
     </w:p>
     <w:p>

</xml_diff>

<commit_message>
Ajusta legenda de 02/10 (churrasqueira gourmet elétrica) e remove referência interna de 07/10
- Substitui a legenda do post de 02/10 pela versão final da cliente,
  esclarecendo a diferença entre churrasco tradicional (proibido na
  maioria dos condomínios) e churrasqueira gourmet elétrica (permitida)
- Remove a linha de referência interna do dia 07/10 ("carrossel que
  estava em 02/10...), que não deveria aparecer no material final

Co-Authored-By: Claude Sonnet 5 <noreply@anthropic.com>
Claude-Session: https://claude.ai/code/session_01Qco3rELextfq6k1B91gUBk
</commit_message>
<xml_diff>
--- a/strategia-sindicos/calendarios-editoriais/Calendario_Editorial_Strategia_Outubro2026.docx
+++ b/strategia-sindicos/calendarios-editoriais/Calendario_Editorial_Strategia_Outubro2026.docx
@@ -147,46 +147,43 @@
     <w:p>
       <w:pPr/>
       <w:r>
-        <w:rPr>
-          <w:b w:val="0"/>
-        </w:rPr>
-        <w:t>Moradores do condomínio podem fazer churrasco na sacada?</w:t>
+        <w:t>🔥 Respondendo as dúvidas que mais recebemos por aqui: moradores podem fazer churrasco na sacada?</w:t>
       </w:r>
     </w:p>
     <w:p>
       <w:pPr/>
       <w:r>
-        <w:rPr>
-          <w:b w:val="0"/>
-        </w:rPr>
-        <w:t>Depende. Se a sacada foi projetada como "sacada gourmet" — com churrasqueira embutida, exaustão adequada e estrutura própria pra isso — geralmente pode, desde que respeitando os horários e o convívio previstos na convenção.</w:t>
+        <w:t>A resposta é: depende do tipo de churrasqueira! 👀</w:t>
       </w:r>
     </w:p>
     <w:p>
       <w:pPr/>
       <w:r>
-        <w:rPr>
-          <w:b w:val="0"/>
-        </w:rPr>
-        <w:t>Já em sacadas comuns, sem essa estrutura, o uso de churrasqueira costuma ser proibido: risco de incêndio, fumaça incomodando outros moradores e falta de ventilação adequada.</w:t>
+        <w:t>Na maioria dos condomínios, o churrasco tradicional (carvão ou fogo aberto) é proibido em sacadas e varandas. Isso porque a fumaça se espalha facilmente entre os andares, entra pelas janelas dos vizinhos e pode até acionar o sistema de incêndio do prédio.</w:t>
       </w:r>
     </w:p>
     <w:p>
       <w:pPr/>
       <w:r>
-        <w:rPr>
-          <w:b w:val="0"/>
-        </w:rPr>
-        <w:t>Antes de acender o carvão, vale conferir o que diz a convenção do seu condomínio.</w:t>
+        <w:t>Já a churrasqueira gourmet elétrica é permitida! E o motivo é simples: ela conta com sistema de exaustão e controle de fumaça, o que faz toda a diferença na convivência entre vizinhos. Com ela, você aproveita momentos de lazer com a família e amigos sem incomodar quem mora ao lado ou nos andares vizinhos.</w:t>
       </w:r>
     </w:p>
     <w:p>
       <w:pPr/>
       <w:r>
-        <w:rPr>
-          <w:b w:val="0"/>
-        </w:rPr>
-        <w:t>Comente: CONDOMÍNIO e olhe o seu direct — nossa equipe te ajuda a entender as regras do seu prédio.</w:t>
+        <w:t>Ou seja: quer fazer aquele churrasco na sacada? Invista em uma churrasqueira gourmet e curta sem preocupação! 🍖🔥</w:t>
+      </w:r>
+    </w:p>
+    <w:p>
+      <w:pPr/>
+      <w:r>
+        <w:t>📌 Vale lembrar: cada condomínio tem sua própria convenção e regimento interno, então sempre confira as regras específicas do seu prédio antes de instalar qualquer equipamento.</w:t>
+      </w:r>
+    </w:p>
+    <w:p>
+      <w:pPr/>
+      <w:r>
+        <w:t>E se você tiver mais dúvidas sobre a gestão do que pode ou não pode no seu condomínio, comente CONDOMÍNIO que vamos te atender no direct, ou se preferir, clique no link da bio 👆</w:t>
       </w:r>
     </w:p>
     <w:p>
@@ -222,15 +219,6 @@
       </w:pPr>
       <w:r>
         <w:t>Quarta, 07/10</w:t>
-      </w:r>
-    </w:p>
-    <w:p>
-      <w:pPr/>
-      <w:r>
-        <w:rPr>
-          <w:b w:val="0"/>
-        </w:rPr>
-        <w:t>Referência: carrossel que estava em 02/10, aprofundado a pedido da cliente</w:t>
       </w:r>
     </w:p>
     <w:p>

</xml_diff>

<commit_message>
Troca conteúdo de 09/10: post estático de dúvida comum (fumar no apartamento)
Substitui o carrossel de humor ("síndico eternizado no cargo") por um
post estático no mesmo formato do dia 02/10 (pergunta na imagem,
resposta na legenda): "Fumar dentro do apartamento pode?" — resposta:
se incomoda o vizinho, não pode.

Co-Authored-By: Claude Sonnet 5 <noreply@anthropic.com>
Claude-Session: https://claude.ai/code/session_01Qco3rELextfq6k1B91gUBk
</commit_message>
<xml_diff>
--- a/strategia-sindicos/calendarios-editoriais/Calendario_Editorial_Strategia_Outubro2026.docx
+++ b/strategia-sindicos/calendarios-editoriais/Calendario_Editorial_Strategia_Outubro2026.docx
@@ -487,7 +487,7 @@
         <w:rPr>
           <w:b w:val="0"/>
         </w:rPr>
-        <w:t>Referência: mesma piada que estava prevista para vídeo, adaptada para carrossel/ilustração (sem necessidade de filmagem)</w:t>
+        <w:t>Referência: post estático de dúvida comum, mesmo formato do post de 02/10 (pergunta na imagem + resposta na legenda)</w:t>
       </w:r>
     </w:p>
     <w:p>
@@ -496,7 +496,7 @@
         <w:rPr>
           <w:b w:val="0"/>
         </w:rPr>
-        <w:t>Objetivo: Geração de demanda — mesmo tema de 07/10 e 21/10 (assembleia), agora em tom humorado</w:t>
+        <w:t>Objetivo: Educar de forma rápida e direta / autoridade técnica</w:t>
       </w:r>
     </w:p>
     <w:p>
@@ -505,7 +505,7 @@
         <w:rPr>
           <w:b w:val="0"/>
         </w:rPr>
-        <w:t>Temática macro: O síndico "eternizado" no cargo, porque ninguém mais quis assumir</w:t>
+        <w:t>Temática macro: Fumar dentro do apartamento pode?</w:t>
       </w:r>
     </w:p>
     <w:p>
@@ -514,7 +514,7 @@
         <w:rPr>
           <w:b w:val="0"/>
         </w:rPr>
-        <w:t>Eixo: Gatilho de humor: reconduzir o síndico no automático, só porque ninguém se candidatou · Desejo: leveza e identificação</w:t>
+        <w:t>Eixo: Dor: dúvida comum e mal resolvida no dia a dia do condomínio · Desejo: resposta clara e com respaldo na convenção</w:t>
       </w:r>
     </w:p>
     <w:p>
@@ -523,7 +523,7 @@
         <w:rPr>
           <w:b/>
         </w:rPr>
-        <w:t>Cards</w:t>
+        <w:t>Conteúdo do post</w:t>
       </w:r>
     </w:p>
     <w:p>
@@ -532,7 +532,7 @@
         <w:rPr>
           <w:b w:val="0"/>
         </w:rPr>
-        <w:t>Card 1 — Capa</w:t>
+        <w:t>Formato: post estático (pergunta na imagem + resposta na legenda)</w:t>
       </w:r>
     </w:p>
     <w:p>
@@ -541,7 +541,7 @@
         <w:rPr>
           <w:b w:val="0"/>
         </w:rPr>
-        <w:t>Headline: "Alguém se candidata a síndico?"</w:t>
+        <w:t>Headline: Fumar dentro do apartamento pode?</w:t>
       </w:r>
     </w:p>
     <w:p>
@@ -550,7 +550,7 @@
         <w:rPr>
           <w:b w:val="0"/>
         </w:rPr>
-        <w:t>Visual: ilustração leve com tom de humor — uma assembleia de condomínio, todo mundo olhando para o teto/para o lado, ninguém levanta a mão. Fundo claro.</w:t>
+        <w:t>Sub-headline: Resposta na legenda.</w:t>
       </w:r>
     </w:p>
     <w:p>
@@ -559,79 +559,7 @@
         <w:rPr>
           <w:b w:val="0"/>
         </w:rPr>
-        <w:t>Card 2</w:t>
-      </w:r>
-    </w:p>
-    <w:p>
-      <w:pPr/>
-      <w:r>
-        <w:rPr>
-          <w:b w:val="0"/>
-        </w:rPr>
-        <w:t>"..."</w:t>
-      </w:r>
-    </w:p>
-    <w:p>
-      <w:pPr/>
-      <w:r>
-        <w:rPr>
-          <w:b w:val="0"/>
-        </w:rPr>
-        <w:t>Visual: mesma cena, silêncio constrangedor, relógio marcando o tempo passando.</w:t>
-      </w:r>
-    </w:p>
-    <w:p>
-      <w:pPr/>
-      <w:r>
-        <w:rPr>
-          <w:b w:val="0"/>
-        </w:rPr>
-        <w:t>Card 3</w:t>
-      </w:r>
-    </w:p>
-    <w:p>
-      <w:pPr/>
-      <w:r>
-        <w:rPr>
-          <w:b w:val="0"/>
-        </w:rPr>
-        <w:t>"E assim, pelo quinto ano seguido, ele foi reeleito. Por unanimidade. Por falta de opção."</w:t>
-      </w:r>
-    </w:p>
-    <w:p>
-      <w:pPr/>
-      <w:r>
-        <w:rPr>
-          <w:b w:val="0"/>
-        </w:rPr>
-        <w:t>Visual: ilustração do mesmo morador de sempre, cara de resignado, sendo aplaudido sem muito entusiasmo.</w:t>
-      </w:r>
-    </w:p>
-    <w:p>
-      <w:pPr/>
-      <w:r>
-        <w:rPr>
-          <w:b w:val="0"/>
-        </w:rPr>
-        <w:t>Card 4 — CTA</w:t>
-      </w:r>
-    </w:p>
-    <w:p>
-      <w:pPr/>
-      <w:r>
-        <w:rPr>
-          <w:b w:val="0"/>
-        </w:rPr>
-        <w:t>Se a sua assembleia também "resolve" assim, talvez seja hora de considerar uma opção que não depende de ninguém topar o perrengue.</w:t>
-      </w:r>
-    </w:p>
-    <w:p>
-      <w:pPr/>
-      <w:r>
-        <w:rPr>
-          <w:b w:val="0"/>
-        </w:rPr>
-        <w:t>Comente: ASSEMBLEIA e olhe o seu direct.</w:t>
+        <w:t>Visual: cigarro/cinzeiro em ambiente de apartamento, ou fumaça saindo de uma janela em direção à janela do vizinho.</w:t>
       </w:r>
     </w:p>
     <w:p>
@@ -649,7 +577,7 @@
         <w:rPr>
           <w:b w:val="0"/>
         </w:rPr>
-        <w:t>Se a sua assembleia também "resolve" assim, talvez seja hora de considerar uma opção que não depende de ninguém topar o perrengue 😅</w:t>
+        <w:t>Fumar dentro do apartamento pode?</w:t>
       </w:r>
     </w:p>
     <w:p>
@@ -658,7 +586,7 @@
         <w:rPr>
           <w:b w:val="0"/>
         </w:rPr>
-        <w:t>Ainda dá tempo de conhecer a Strategia antes da sua assembleia.</w:t>
+        <w:t>Se está incomodando o vizinho, não pode.</w:t>
       </w:r>
     </w:p>
     <w:p>
@@ -667,7 +595,25 @@
         <w:rPr>
           <w:b w:val="0"/>
         </w:rPr>
-        <w:t>Comente: ASSEMBLEIA e olhe o seu direct.</w:t>
+        <w:t>A fumaça do cigarro se espalha facilmente entre as unidades — pela janela, pelo duto de ventilação ou até pela varanda — e pode virar motivo de reclamação formal por perturbação do sossego e incômodo à saúde de quem convive com o cheiro.</w:t>
+      </w:r>
+    </w:p>
+    <w:p>
+      <w:pPr/>
+      <w:r>
+        <w:rPr>
+          <w:b w:val="0"/>
+        </w:rPr>
+        <w:t>Muitos condomínios já preveem isso no regimento interno, com regras específicas sobre fumar em áreas privativas que afetam a convivência.</w:t>
+      </w:r>
+    </w:p>
+    <w:p>
+      <w:pPr/>
+      <w:r>
+        <w:rPr>
+          <w:b w:val="0"/>
+        </w:rPr>
+        <w:t>Ficou com dúvida sobre alguma regra do seu condomínio? Comente: CONDOMÍNIO e olhe o seu direct — nossa equipe vai te orientar.</w:t>
       </w:r>
     </w:p>
     <w:p>
@@ -685,7 +631,7 @@
         <w:rPr>
           <w:b w:val="0"/>
         </w:rPr>
-        <w:t>S1: Assembleia decidindo síndico por eliminação, alguém se identifica? 👀</w:t>
+        <w:t>S1: Seu condomínio já teve alguma reclamação sobre fumaça de cigarro? (enquete: Já, mais de uma vez / Nunca)</w:t>
       </w:r>
     </w:p>
     <w:p>
@@ -694,7 +640,7 @@
         <w:rPr>
           <w:b w:val="0"/>
         </w:rPr>
-        <w:t>S2: Confere o carrossel completo no feed e comenta ASSEMBLEIA. 👆</w:t>
+        <w:t>S2: A resposta completa está no post de hoje. Confere lá e comenta CONDOMÍNIO. 👆</w:t>
       </w:r>
     </w:p>
     <w:p>

</xml_diff>